<commit_message>
docs: add Tax Invoice / RA Bill GST compliance task to pending list
</commit_message>
<xml_diff>
--- a/construct-erp/erp-pending-list.docx
+++ b/construct-erp/erp-pending-list.docx
@@ -1645,6 +1645,157 @@
                 <w:sz w:val="18"/>
                 <w:szCs w:val="18"/>
               </w:rPr>
+              <w:t xml:space="preserve">GST / RA Bill</w:t>
+            </w:r>
+          </w:p>
+        </w:tc>
+        <w:tc>
+          <w:tcPr>
+            <w:tcW w:type="dxa" w:w="5800"/>
+            <w:tcBorders>
+              <w:top w:val="single" w:color="CCCCCC" w:sz="1"/>
+              <w:left w:val="single" w:color="CCCCCC" w:sz="1"/>
+              <w:bottom w:val="single" w:color="CCCCCC" w:sz="1"/>
+              <w:right w:val="single" w:color="CCCCCC" w:sz="1"/>
+            </w:tcBorders>
+            <w:tcMar>
+              <w:top w:type="dxa" w:w="80"/>
+              <w:left w:type="dxa" w:w="120"/>
+              <w:bottom w:type="dxa" w:w="80"/>
+              <w:right w:type="dxa" w:w="120"/>
+            </w:tcMar>
+          </w:tcPr>
+          <w:p>
+            <w:r>
+              <w:rPr>
+                <w:rFonts w:ascii="Arial" w:cs="Arial" w:eastAsia="Arial" w:hAnsi="Arial"/>
+                <w:b w:val="false"/>
+                <w:bCs w:val="false"/>
+                <w:sz w:val="18"/>
+                <w:szCs w:val="18"/>
+              </w:rPr>
+              <w:t xml:space="preserve">Tax Invoice for RA Bill needs update for GST compliance — CGST/SGST/IGST fields, HSN 9954, Works Contract tax structure to be added to invoice print</w:t>
+            </w:r>
+          </w:p>
+        </w:tc>
+        <w:tc>
+          <w:tcPr>
+            <w:tcW w:type="dxa" w:w="1700"/>
+            <w:tcBorders>
+              <w:top w:val="single" w:color="CCCCCC" w:sz="1"/>
+              <w:left w:val="single" w:color="CCCCCC" w:sz="1"/>
+              <w:bottom w:val="single" w:color="CCCCCC" w:sz="1"/>
+              <w:right w:val="single" w:color="CCCCCC" w:sz="1"/>
+            </w:tcBorders>
+            <w:tcMar>
+              <w:top w:type="dxa" w:w="80"/>
+              <w:left w:type="dxa" w:w="120"/>
+              <w:bottom w:type="dxa" w:w="80"/>
+              <w:right w:type="dxa" w:w="120"/>
+            </w:tcMar>
+          </w:tcPr>
+          <w:p>
+            <w:pPr>
+              <w:jc w:val="center"/>
+            </w:pPr>
+            <w:r>
+              <w:rPr>
+                <w:rFonts w:ascii="Arial" w:cs="Arial" w:eastAsia="Arial" w:hAnsi="Arial"/>
+                <w:b/>
+                <w:bCs/>
+                <w:color w:val="CC6600"/>
+                <w:sz w:val="18"/>
+                <w:szCs w:val="18"/>
+              </w:rPr>
+              <w:t xml:space="preserve">Pending</w:t>
+            </w:r>
+          </w:p>
+        </w:tc>
+        <w:tc>
+          <w:tcPr>
+            <w:tcW w:type="dxa" w:w="1100"/>
+            <w:tcBorders>
+              <w:top w:val="single" w:color="CCCCCC" w:sz="1"/>
+              <w:left w:val="single" w:color="CCCCCC" w:sz="1"/>
+              <w:bottom w:val="single" w:color="CCCCCC" w:sz="1"/>
+              <w:right w:val="single" w:color="CCCCCC" w:sz="1"/>
+            </w:tcBorders>
+            <w:tcMar>
+              <w:top w:type="dxa" w:w="80"/>
+              <w:left w:type="dxa" w:w="120"/>
+              <w:bottom w:type="dxa" w:w="80"/>
+              <w:right w:type="dxa" w:w="120"/>
+            </w:tcMar>
+          </w:tcPr>
+          <w:p>
+            <w:r>
+              <w:rPr>
+                <w:rFonts w:ascii="Arial" w:cs="Arial" w:eastAsia="Arial" w:hAnsi="Arial"/>
+                <w:b w:val="false"/>
+                <w:bCs w:val="false"/>
+                <w:sz w:val="18"/>
+                <w:szCs w:val="18"/>
+              </w:rPr>
+              <w:t xml:space="preserve">High</w:t>
+            </w:r>
+          </w:p>
+        </w:tc>
+        <w:tc>
+          <w:tcPr>
+            <w:tcW w:type="dxa" w:w="1280"/>
+            <w:tcBorders>
+              <w:top w:val="single" w:color="CCCCCC" w:sz="1"/>
+              <w:left w:val="single" w:color="CCCCCC" w:sz="1"/>
+              <w:bottom w:val="single" w:color="CCCCCC" w:sz="1"/>
+              <w:right w:val="single" w:color="CCCCCC" w:sz="1"/>
+            </w:tcBorders>
+            <w:tcMar>
+              <w:top w:type="dxa" w:w="80"/>
+              <w:left w:type="dxa" w:w="120"/>
+              <w:bottom w:type="dxa" w:w="80"/>
+              <w:right w:type="dxa" w:w="120"/>
+            </w:tcMar>
+          </w:tcPr>
+          <w:p>
+            <w:r>
+              <w:rPr>
+                <w:rFonts w:ascii="Arial" w:cs="Arial" w:eastAsia="Arial" w:hAnsi="Arial"/>
+                <w:b w:val="false"/>
+                <w:bCs w:val="false"/>
+                <w:sz w:val="18"/>
+                <w:szCs w:val="18"/>
+              </w:rPr>
+              <w:t xml:space="preserve">—</w:t>
+            </w:r>
+          </w:p>
+        </w:tc>
+      </w:tr>
+      <w:tr>
+        <w:tc>
+          <w:tcPr>
+            <w:tcW w:type="dxa" w:w="1800"/>
+            <w:tcBorders>
+              <w:top w:val="single" w:color="CCCCCC" w:sz="1"/>
+              <w:left w:val="single" w:color="CCCCCC" w:sz="1"/>
+              <w:bottom w:val="single" w:color="CCCCCC" w:sz="1"/>
+              <w:right w:val="single" w:color="CCCCCC" w:sz="1"/>
+            </w:tcBorders>
+            <w:tcMar>
+              <w:top w:type="dxa" w:w="80"/>
+              <w:left w:type="dxa" w:w="120"/>
+              <w:bottom w:type="dxa" w:w="80"/>
+              <w:right w:type="dxa" w:w="120"/>
+            </w:tcMar>
+          </w:tcPr>
+          <w:p>
+            <w:r>
+              <w:rPr>
+                <w:rFonts w:ascii="Arial" w:cs="Arial" w:eastAsia="Arial" w:hAnsi="Arial"/>
+                <w:b/>
+                <w:bCs/>
+                <w:sz w:val="18"/>
+                <w:szCs w:val="18"/>
+              </w:rPr>
               <w:t xml:space="preserve">GST Page</w:t>
             </w:r>
           </w:p>
@@ -1975,6 +2126,19 @@
           <w:szCs w:val="18"/>
         </w:rPr>
         <w:t xml:space="preserve">3.  Pcs unit will appear in MRS dropdowns after next Railway deploy.</w:t>
+      </w:r>
+    </w:p>
+    <w:p>
+      <w:pPr>
+        <w:spacing w:after="100"/>
+      </w:pPr>
+      <w:r>
+        <w:rPr>
+          <w:rFonts w:ascii="Arial" w:cs="Arial" w:eastAsia="Arial" w:hAnsi="Arial"/>
+          <w:sz w:val="18"/>
+          <w:szCs w:val="18"/>
+        </w:rPr>
+        <w:t xml:space="preserve">4.  GST / RA Bill Tax Invoice: needs CGST/SGST/IGST breakdown, HSN 9954 (Works Contract), and GST compliance fields on the invoice print template.</w:t>
       </w:r>
     </w:p>
     <w:sectPr>

</xml_diff>